<commit_message>
Mise à jour du projet d'exemple
</commit_message>
<xml_diff>
--- a/Session 11.1/Cours11.1.docx
+++ b/Session 11.1/Cours11.1.docx
@@ -241,15 +241,7 @@
                 <w:bCs w:val="0"/>
                 <w:lang w:val="fr-CH"/>
               </w:rPr>
-              <w:t xml:space="preserve"> de </w:t>
-            </w:r>
-            <w:r>
-              <w:rPr>
-                <w:b w:val="0"/>
-                <w:bCs w:val="0"/>
-                <w:lang w:val="fr-CH"/>
-              </w:rPr>
-              <w:t>nouveau compte</w:t>
+              <w:t xml:space="preserve"> de nouveau compte</w:t>
             </w:r>
           </w:p>
         </w:tc>
@@ -305,15 +297,7 @@
                 <w:bCs w:val="0"/>
                 <w:lang w:val="fr-CH"/>
               </w:rPr>
-              <w:t xml:space="preserve"> de</w:t>
-            </w:r>
-            <w:r>
-              <w:rPr>
-                <w:b w:val="0"/>
-                <w:bCs w:val="0"/>
-                <w:lang w:val="fr-CH"/>
-              </w:rPr>
-              <w:t xml:space="preserve"> connexion</w:t>
+              <w:t xml:space="preserve"> de connexion</w:t>
             </w:r>
           </w:p>
         </w:tc>
@@ -804,7 +788,6 @@
     <w:p>
       <w:pPr>
         <w:pStyle w:val="Heading1"/>
-        <w:cnfStyle w:val="001000000000" w:firstRow="0" w:lastRow="0" w:firstColumn="1" w:lastColumn="0" w:oddVBand="0" w:evenVBand="0" w:oddHBand="0" w:evenHBand="0" w:firstRowFirstColumn="0" w:firstRowLastColumn="0" w:lastRowFirstColumn="0" w:lastRowLastColumn="0"/>
         <w:rPr>
           <w:lang w:val="fr-CH"/>
         </w:rPr>
@@ -914,7 +897,6 @@
     </w:p>
     <w:p>
       <w:pPr>
-        <w:cnfStyle w:val="001000000000" w:firstRow="0" w:lastRow="0" w:firstColumn="1" w:lastColumn="0" w:oddVBand="0" w:evenVBand="0" w:oddHBand="0" w:evenHBand="0" w:firstRowFirstColumn="0" w:firstRowLastColumn="0" w:lastRowFirstColumn="0" w:lastRowLastColumn="0"/>
         <w:rPr>
           <w:lang w:val="fr-CH"/>
         </w:rPr>
@@ -970,7 +952,6 @@
     </w:p>
     <w:p>
       <w:pPr>
-        <w:cnfStyle w:val="001000000000" w:firstRow="0" w:lastRow="0" w:firstColumn="1" w:lastColumn="0" w:oddVBand="0" w:evenVBand="0" w:oddHBand="0" w:evenHBand="0" w:firstRowFirstColumn="0" w:firstRowLastColumn="0" w:lastRowFirstColumn="0" w:lastRowLastColumn="0"/>
         <w:rPr>
           <w:lang w:val="fr-CH"/>
         </w:rPr>
@@ -979,7 +960,6 @@
     <w:p>
       <w:pPr>
         <w:pStyle w:val="Heading1"/>
-        <w:cnfStyle w:val="001000000000" w:firstRow="0" w:lastRow="0" w:firstColumn="1" w:lastColumn="0" w:oddVBand="0" w:evenVBand="0" w:oddHBand="0" w:evenHBand="0" w:firstRowFirstColumn="0" w:firstRowLastColumn="0" w:lastRowFirstColumn="0" w:lastRowLastColumn="0"/>
         <w:rPr>
           <w:lang w:val="fr-CH"/>
         </w:rPr>
@@ -1026,7 +1006,6 @@
     </w:p>
     <w:p>
       <w:pPr>
-        <w:cnfStyle w:val="001000000000" w:firstRow="0" w:lastRow="0" w:firstColumn="1" w:lastColumn="0" w:oddVBand="0" w:evenVBand="0" w:oddHBand="0" w:evenHBand="0" w:firstRowFirstColumn="0" w:firstRowLastColumn="0" w:lastRowFirstColumn="0" w:lastRowLastColumn="0"/>
         <w:rPr>
           <w:lang w:val="fr-CH"/>
         </w:rPr>
@@ -1075,7 +1054,6 @@
     </w:p>
     <w:p>
       <w:pPr>
-        <w:cnfStyle w:val="001000000000" w:firstRow="0" w:lastRow="0" w:firstColumn="1" w:lastColumn="0" w:oddVBand="0" w:evenVBand="0" w:oddHBand="0" w:evenHBand="0" w:firstRowFirstColumn="0" w:firstRowLastColumn="0" w:lastRowFirstColumn="0" w:lastRowLastColumn="0"/>
         <w:rPr>
           <w:lang w:val="fr-CH"/>
         </w:rPr>
@@ -1084,7 +1062,6 @@
     <w:p>
       <w:pPr>
         <w:pStyle w:val="Heading1"/>
-        <w:cnfStyle w:val="001000100000" w:firstRow="0" w:lastRow="0" w:firstColumn="1" w:lastColumn="0" w:oddVBand="0" w:evenVBand="0" w:oddHBand="1" w:evenHBand="0" w:firstRowFirstColumn="0" w:firstRowLastColumn="0" w:lastRowFirstColumn="0" w:lastRowLastColumn="0"/>
         <w:rPr>
           <w:lang w:val="fr-CH"/>
         </w:rPr>
@@ -1203,7 +1180,6 @@
     </w:p>
     <w:p>
       <w:pPr>
-        <w:cnfStyle w:val="001000100000" w:firstRow="0" w:lastRow="0" w:firstColumn="1" w:lastColumn="0" w:oddVBand="0" w:evenVBand="0" w:oddHBand="1" w:evenHBand="0" w:firstRowFirstColumn="0" w:firstRowLastColumn="0" w:lastRowFirstColumn="0" w:lastRowLastColumn="0"/>
         <w:rPr>
           <w:lang w:val="fr-CH"/>
         </w:rPr>
@@ -1212,7 +1188,6 @@
     <w:p>
       <w:pPr>
         <w:pStyle w:val="Heading1"/>
-        <w:cnfStyle w:val="001000000000" w:firstRow="0" w:lastRow="0" w:firstColumn="1" w:lastColumn="0" w:oddVBand="0" w:evenVBand="0" w:oddHBand="0" w:evenHBand="0" w:firstRowFirstColumn="0" w:firstRowLastColumn="0" w:lastRowFirstColumn="0" w:lastRowLastColumn="0"/>
         <w:rPr>
           <w:lang w:val="fr-CH"/>
         </w:rPr>
@@ -1227,7 +1202,6 @@
     <w:p>
       <w:pPr>
         <w:pStyle w:val="Heading2"/>
-        <w:cnfStyle w:val="001000000000" w:firstRow="0" w:lastRow="0" w:firstColumn="1" w:lastColumn="0" w:oddVBand="0" w:evenVBand="0" w:oddHBand="0" w:evenHBand="0" w:firstRowFirstColumn="0" w:firstRowLastColumn="0" w:lastRowFirstColumn="0" w:lastRowLastColumn="0"/>
         <w:rPr>
           <w:lang w:val="fr-CH"/>
         </w:rPr>
@@ -1241,7 +1215,6 @@
     </w:p>
     <w:p>
       <w:pPr>
-        <w:cnfStyle w:val="001000000000" w:firstRow="0" w:lastRow="0" w:firstColumn="1" w:lastColumn="0" w:oddVBand="0" w:evenVBand="0" w:oddHBand="0" w:evenHBand="0" w:firstRowFirstColumn="0" w:firstRowLastColumn="0" w:lastRowFirstColumn="0" w:lastRowLastColumn="0"/>
         <w:rPr>
           <w:lang w:val="fr-CH"/>
         </w:rPr>
@@ -1271,7 +1244,6 @@
     </w:p>
     <w:p>
       <w:pPr>
-        <w:cnfStyle w:val="001000000000" w:firstRow="0" w:lastRow="0" w:firstColumn="1" w:lastColumn="0" w:oddVBand="0" w:evenVBand="0" w:oddHBand="0" w:evenHBand="0" w:firstRowFirstColumn="0" w:firstRowLastColumn="0" w:lastRowFirstColumn="0" w:lastRowLastColumn="0"/>
         <w:rPr>
           <w:lang w:val="fr-CH"/>
         </w:rPr>
@@ -1342,7 +1314,6 @@
     <w:p>
       <w:pPr>
         <w:pStyle w:val="Heading2"/>
-        <w:cnfStyle w:val="001000000000" w:firstRow="0" w:lastRow="0" w:firstColumn="1" w:lastColumn="0" w:oddVBand="0" w:evenVBand="0" w:oddHBand="0" w:evenHBand="0" w:firstRowFirstColumn="0" w:firstRowLastColumn="0" w:lastRowFirstColumn="0" w:lastRowLastColumn="0"/>
         <w:rPr>
           <w:lang w:val="fr-CH"/>
         </w:rPr>
@@ -1356,7 +1327,6 @@
     </w:p>
     <w:p>
       <w:pPr>
-        <w:cnfStyle w:val="001000000000" w:firstRow="0" w:lastRow="0" w:firstColumn="1" w:lastColumn="0" w:oddVBand="0" w:evenVBand="0" w:oddHBand="0" w:evenHBand="0" w:firstRowFirstColumn="0" w:firstRowLastColumn="0" w:lastRowFirstColumn="0" w:lastRowLastColumn="0"/>
         <w:rPr>
           <w:lang w:val="fr-CH"/>
         </w:rPr>
@@ -1383,6 +1353,7 @@
       </w:r>
       <w:r>
         <w:rPr>
+          <w:noProof/>
           <w:lang w:val="fr-CH"/>
         </w:rPr>
         <w:drawing>
@@ -1424,7 +1395,6 @@
     </w:p>
     <w:p>
       <w:pPr>
-        <w:cnfStyle w:val="001000000000" w:firstRow="0" w:lastRow="0" w:firstColumn="1" w:lastColumn="0" w:oddVBand="0" w:evenVBand="0" w:oddHBand="0" w:evenHBand="0" w:firstRowFirstColumn="0" w:firstRowLastColumn="0" w:lastRowFirstColumn="0" w:lastRowLastColumn="0"/>
         <w:rPr>
           <w:lang w:val="fr-CH"/>
         </w:rPr>
@@ -1452,21 +1422,19 @@
     </w:p>
     <w:p>
       <w:pPr>
-        <w:cnfStyle w:val="001000000000" w:firstRow="0" w:lastRow="0" w:firstColumn="1" w:lastColumn="0" w:oddVBand="0" w:evenVBand="0" w:oddHBand="0" w:evenHBand="0" w:firstRowFirstColumn="0" w:firstRowLastColumn="0" w:lastRowFirstColumn="0" w:lastRowLastColumn="0"/>
-        <w:rPr>
-          <w:lang w:val="fr-CH"/>
-        </w:rPr>
-      </w:pPr>
-      <w:r>
-        <w:rPr>
-          <w:lang w:val="fr-CH"/>
-        </w:rPr>
-        <w:lastRenderedPageBreak/>
+        <w:rPr>
+          <w:lang w:val="fr-CH"/>
+        </w:rPr>
+      </w:pPr>
+      <w:r>
+        <w:rPr>
+          <w:lang w:val="fr-CH"/>
+        </w:rPr>
         <w:drawing>
-          <wp:inline distT="0" distB="0" distL="0" distR="0" wp14:anchorId="2053D64A" wp14:editId="43D1BF01">
-            <wp:extent cx="5760720" cy="2023110"/>
-            <wp:effectExtent l="0" t="0" r="0" b="0"/>
-            <wp:docPr id="839509775" name="Picture 1"/>
+          <wp:inline distT="0" distB="0" distL="0" distR="0" wp14:anchorId="17AEFFE5" wp14:editId="7F708F71">
+            <wp:extent cx="5760720" cy="1366520"/>
+            <wp:effectExtent l="0" t="0" r="0" b="5080"/>
+            <wp:docPr id="595490201" name="Picture 1"/>
             <wp:cNvGraphicFramePr>
               <a:graphicFrameLocks xmlns:a="http://schemas.openxmlformats.org/drawingml/2006/main" noChangeAspect="1"/>
             </wp:cNvGraphicFramePr>
@@ -1474,7 +1442,7 @@
               <a:graphicData uri="http://schemas.openxmlformats.org/drawingml/2006/picture">
                 <pic:pic xmlns:pic="http://schemas.openxmlformats.org/drawingml/2006/picture">
                   <pic:nvPicPr>
-                    <pic:cNvPr id="839509775" name=""/>
+                    <pic:cNvPr id="595490201" name=""/>
                     <pic:cNvPicPr/>
                   </pic:nvPicPr>
                   <pic:blipFill>
@@ -1486,7 +1454,7 @@
                   <pic:spPr>
                     <a:xfrm>
                       <a:off x="0" y="0"/>
-                      <a:ext cx="5760720" cy="2023110"/>
+                      <a:ext cx="5760720" cy="1366520"/>
                     </a:xfrm>
                     <a:prstGeom prst="rect">
                       <a:avLst/>
@@ -1501,15 +1469,13 @@
     </w:p>
     <w:p>
       <w:pPr>
-        <w:cnfStyle w:val="001000000000" w:firstRow="0" w:lastRow="0" w:firstColumn="1" w:lastColumn="0" w:oddVBand="0" w:evenVBand="0" w:oddHBand="0" w:evenHBand="0" w:firstRowFirstColumn="0" w:firstRowLastColumn="0" w:lastRowFirstColumn="0" w:lastRowLastColumn="0"/>
-        <w:rPr>
-          <w:lang w:val="fr-CH"/>
-        </w:rPr>
-      </w:pPr>
-    </w:p>
-    <w:p>
-      <w:pPr>
-        <w:cnfStyle w:val="001000000000" w:firstRow="0" w:lastRow="0" w:firstColumn="1" w:lastColumn="0" w:oddVBand="0" w:evenVBand="0" w:oddHBand="0" w:evenHBand="0" w:firstRowFirstColumn="0" w:firstRowLastColumn="0" w:lastRowFirstColumn="0" w:lastRowLastColumn="0"/>
+        <w:rPr>
+          <w:lang w:val="fr-CH"/>
+        </w:rPr>
+      </w:pPr>
+    </w:p>
+    <w:p>
+      <w:pPr>
         <w:rPr>
           <w:lang w:val="fr-CH"/>
         </w:rPr>
@@ -1523,13 +1489,13 @@
     </w:p>
     <w:p>
       <w:pPr>
-        <w:cnfStyle w:val="001000000000" w:firstRow="0" w:lastRow="0" w:firstColumn="1" w:lastColumn="0" w:oddVBand="0" w:evenVBand="0" w:oddHBand="0" w:evenHBand="0" w:firstRowFirstColumn="0" w:firstRowLastColumn="0" w:lastRowFirstColumn="0" w:lastRowLastColumn="0"/>
-        <w:rPr>
-          <w:lang w:val="fr-CH"/>
-        </w:rPr>
-      </w:pPr>
-      <w:r>
-        <w:rPr>
+        <w:rPr>
+          <w:lang w:val="fr-CH"/>
+        </w:rPr>
+      </w:pPr>
+      <w:r>
+        <w:rPr>
+          <w:noProof/>
           <w:lang w:val="fr-CH"/>
         </w:rPr>
         <w:drawing>
@@ -1571,7 +1537,6 @@
     </w:p>
     <w:p>
       <w:pPr>
-        <w:cnfStyle w:val="001000000000" w:firstRow="0" w:lastRow="0" w:firstColumn="1" w:lastColumn="0" w:oddVBand="0" w:evenVBand="0" w:oddHBand="0" w:evenHBand="0" w:firstRowFirstColumn="0" w:firstRowLastColumn="0" w:lastRowFirstColumn="0" w:lastRowLastColumn="0"/>
         <w:rPr>
           <w:lang w:val="fr-CH"/>
         </w:rPr>
@@ -1585,13 +1550,13 @@
     </w:p>
     <w:p>
       <w:pPr>
-        <w:cnfStyle w:val="001000000000" w:firstRow="0" w:lastRow="0" w:firstColumn="1" w:lastColumn="0" w:oddVBand="0" w:evenVBand="0" w:oddHBand="0" w:evenHBand="0" w:firstRowFirstColumn="0" w:firstRowLastColumn="0" w:lastRowFirstColumn="0" w:lastRowLastColumn="0"/>
-        <w:rPr>
-          <w:lang w:val="fr-CH"/>
-        </w:rPr>
-      </w:pPr>
-      <w:r>
-        <w:rPr>
+        <w:rPr>
+          <w:lang w:val="fr-CH"/>
+        </w:rPr>
+      </w:pPr>
+      <w:r>
+        <w:rPr>
+          <w:noProof/>
           <w:lang w:val="fr-CH"/>
         </w:rPr>
         <w:drawing>
@@ -1633,7 +1598,6 @@
     </w:p>
     <w:p>
       <w:pPr>
-        <w:cnfStyle w:val="001000000000" w:firstRow="0" w:lastRow="0" w:firstColumn="1" w:lastColumn="0" w:oddVBand="0" w:evenVBand="0" w:oddHBand="0" w:evenHBand="0" w:firstRowFirstColumn="0" w:firstRowLastColumn="0" w:lastRowFirstColumn="0" w:lastRowLastColumn="0"/>
         <w:rPr>
           <w:lang w:val="fr-CH"/>
         </w:rPr>
@@ -1642,7 +1606,6 @@
     <w:p>
       <w:pPr>
         <w:pStyle w:val="Heading2"/>
-        <w:cnfStyle w:val="001000000000" w:firstRow="0" w:lastRow="0" w:firstColumn="1" w:lastColumn="0" w:oddVBand="0" w:evenVBand="0" w:oddHBand="0" w:evenHBand="0" w:firstRowFirstColumn="0" w:firstRowLastColumn="0" w:lastRowFirstColumn="0" w:lastRowLastColumn="0"/>
         <w:rPr>
           <w:lang w:val="fr-CH"/>
         </w:rPr>
@@ -1656,7 +1619,6 @@
     </w:p>
     <w:p>
       <w:pPr>
-        <w:cnfStyle w:val="001000000000" w:firstRow="0" w:lastRow="0" w:firstColumn="1" w:lastColumn="0" w:oddVBand="0" w:evenVBand="0" w:oddHBand="0" w:evenHBand="0" w:firstRowFirstColumn="0" w:firstRowLastColumn="0" w:lastRowFirstColumn="0" w:lastRowLastColumn="0"/>
         <w:rPr>
           <w:lang w:val="fr-CH"/>
         </w:rPr>
@@ -1670,13 +1632,13 @@
     </w:p>
     <w:p>
       <w:pPr>
-        <w:cnfStyle w:val="001000000000" w:firstRow="0" w:lastRow="0" w:firstColumn="1" w:lastColumn="0" w:oddVBand="0" w:evenVBand="0" w:oddHBand="0" w:evenHBand="0" w:firstRowFirstColumn="0" w:firstRowLastColumn="0" w:lastRowFirstColumn="0" w:lastRowLastColumn="0"/>
-        <w:rPr>
-          <w:lang w:val="fr-CH"/>
-        </w:rPr>
-      </w:pPr>
-      <w:r>
-        <w:rPr>
+        <w:rPr>
+          <w:lang w:val="fr-CH"/>
+        </w:rPr>
+      </w:pPr>
+      <w:r>
+        <w:rPr>
+          <w:noProof/>
           <w:lang w:val="fr-CH"/>
         </w:rPr>
         <w:drawing>
@@ -1718,7 +1680,6 @@
     </w:p>
     <w:p>
       <w:pPr>
-        <w:cnfStyle w:val="001000000000" w:firstRow="0" w:lastRow="0" w:firstColumn="1" w:lastColumn="0" w:oddVBand="0" w:evenVBand="0" w:oddHBand="0" w:evenHBand="0" w:firstRowFirstColumn="0" w:firstRowLastColumn="0" w:lastRowFirstColumn="0" w:lastRowLastColumn="0"/>
         <w:rPr>
           <w:lang w:val="fr-CH"/>
         </w:rPr>
@@ -1772,16 +1733,15 @@
     </w:p>
     <w:p>
       <w:pPr>
-        <w:cnfStyle w:val="001000000000" w:firstRow="0" w:lastRow="0" w:firstColumn="1" w:lastColumn="0" w:oddVBand="0" w:evenVBand="0" w:oddHBand="0" w:evenHBand="0" w:firstRowFirstColumn="0" w:firstRowLastColumn="0" w:lastRowFirstColumn="0" w:lastRowLastColumn="0"/>
-        <w:rPr>
-          <w:lang w:val="fr-CH"/>
-        </w:rPr>
-      </w:pPr>
-      <w:r>
-        <w:rPr>
-          <w:lang w:val="fr-CH"/>
-        </w:rPr>
-        <w:lastRenderedPageBreak/>
+        <w:rPr>
+          <w:lang w:val="fr-CH"/>
+        </w:rPr>
+      </w:pPr>
+      <w:r>
+        <w:rPr>
+          <w:noProof/>
+          <w:lang w:val="fr-CH"/>
+        </w:rPr>
         <w:drawing>
           <wp:inline distT="0" distB="0" distL="0" distR="0" wp14:anchorId="1CDF2A93" wp14:editId="38711202">
             <wp:extent cx="4000847" cy="1333616"/>
@@ -1821,7 +1781,6 @@
     </w:p>
     <w:p>
       <w:pPr>
-        <w:cnfStyle w:val="001000000000" w:firstRow="0" w:lastRow="0" w:firstColumn="1" w:lastColumn="0" w:oddVBand="0" w:evenVBand="0" w:oddHBand="0" w:evenHBand="0" w:firstRowFirstColumn="0" w:firstRowLastColumn="0" w:lastRowFirstColumn="0" w:lastRowLastColumn="0"/>
         <w:rPr>
           <w:lang w:val="fr-CH"/>
         </w:rPr>
@@ -1830,7 +1789,6 @@
     <w:p>
       <w:pPr>
         <w:pStyle w:val="Heading1"/>
-        <w:cnfStyle w:val="001000100000" w:firstRow="0" w:lastRow="0" w:firstColumn="1" w:lastColumn="0" w:oddVBand="0" w:evenVBand="0" w:oddHBand="1" w:evenHBand="0" w:firstRowFirstColumn="0" w:firstRowLastColumn="0" w:lastRowFirstColumn="0" w:lastRowLastColumn="0"/>
         <w:rPr>
           <w:lang w:val="fr-CH"/>
         </w:rPr>
@@ -1875,7 +1833,6 @@
     </w:p>
     <w:p>
       <w:pPr>
-        <w:cnfStyle w:val="001000100000" w:firstRow="0" w:lastRow="0" w:firstColumn="1" w:lastColumn="0" w:oddVBand="0" w:evenVBand="0" w:oddHBand="1" w:evenHBand="0" w:firstRowFirstColumn="0" w:firstRowLastColumn="0" w:lastRowFirstColumn="0" w:lastRowLastColumn="0"/>
         <w:rPr>
           <w:lang w:val="fr-CH"/>
         </w:rPr>
@@ -1885,6 +1842,7 @@
           <w:noProof/>
           <w:lang w:val="fr-CH"/>
         </w:rPr>
+        <w:lastRenderedPageBreak/>
         <w:drawing>
           <wp:inline distT="0" distB="0" distL="0" distR="0" wp14:anchorId="69105564" wp14:editId="32A8D357">
             <wp:extent cx="3734124" cy="1348857"/>
@@ -1924,7 +1882,6 @@
     </w:p>
     <w:p>
       <w:pPr>
-        <w:cnfStyle w:val="001000100000" w:firstRow="0" w:lastRow="0" w:firstColumn="1" w:lastColumn="0" w:oddVBand="0" w:evenVBand="0" w:oddHBand="1" w:evenHBand="0" w:firstRowFirstColumn="0" w:firstRowLastColumn="0" w:lastRowFirstColumn="0" w:lastRowLastColumn="0"/>
         <w:rPr>
           <w:lang w:val="fr-CH"/>
         </w:rPr>
@@ -1933,7 +1890,6 @@
     <w:p>
       <w:pPr>
         <w:pStyle w:val="Heading1"/>
-        <w:cnfStyle w:val="001000000000" w:firstRow="0" w:lastRow="0" w:firstColumn="1" w:lastColumn="0" w:oddVBand="0" w:evenVBand="0" w:oddHBand="0" w:evenHBand="0" w:firstRowFirstColumn="0" w:firstRowLastColumn="0" w:lastRowFirstColumn="0" w:lastRowLastColumn="0"/>
         <w:rPr>
           <w:lang w:val="fr-CH"/>
         </w:rPr>
@@ -1974,7 +1930,6 @@
     <w:p>
       <w:pPr>
         <w:pStyle w:val="Heading1"/>
-        <w:cnfStyle w:val="001000100000" w:firstRow="0" w:lastRow="0" w:firstColumn="1" w:lastColumn="0" w:oddVBand="0" w:evenVBand="0" w:oddHBand="1" w:evenHBand="0" w:firstRowFirstColumn="0" w:firstRowLastColumn="0" w:lastRowFirstColumn="0" w:lastRowLastColumn="0"/>
         <w:rPr>
           <w:lang w:val="fr-CH"/>
         </w:rPr>
@@ -2943,6 +2898,7 @@
   <w:style w:type="character" w:default="1" w:styleId="DefaultParagraphFont">
     <w:name w:val="Default Paragraph Font"/>
     <w:uiPriority w:val="1"/>
+    <w:semiHidden/>
     <w:unhideWhenUsed/>
   </w:style>
   <w:style w:type="table" w:default="1" w:styleId="TableNormal">

</xml_diff>

<commit_message>
Mise à jour des documents
</commit_message>
<xml_diff>
--- a/Session 11.1/Cours11.1.docx
+++ b/Session 11.1/Cours11.1.docx
@@ -1638,14 +1638,13 @@
       </w:pPr>
       <w:r>
         <w:rPr>
-          <w:noProof/>
           <w:lang w:val="fr-CH"/>
         </w:rPr>
         <w:drawing>
-          <wp:inline distT="0" distB="0" distL="0" distR="0" wp14:anchorId="545B75F6" wp14:editId="53C94F0F">
-            <wp:extent cx="3665538" cy="2720576"/>
-            <wp:effectExtent l="0" t="0" r="0" b="3810"/>
-            <wp:docPr id="875056994" name="Picture 1"/>
+          <wp:inline distT="0" distB="0" distL="0" distR="0" wp14:anchorId="4B4DB2A6" wp14:editId="5FE65D80">
+            <wp:extent cx="5760720" cy="1379220"/>
+            <wp:effectExtent l="0" t="0" r="0" b="0"/>
+            <wp:docPr id="425142570" name="Picture 1"/>
             <wp:cNvGraphicFramePr>
               <a:graphicFrameLocks xmlns:a="http://schemas.openxmlformats.org/drawingml/2006/main" noChangeAspect="1"/>
             </wp:cNvGraphicFramePr>
@@ -1653,7 +1652,7 @@
               <a:graphicData uri="http://schemas.openxmlformats.org/drawingml/2006/picture">
                 <pic:pic xmlns:pic="http://schemas.openxmlformats.org/drawingml/2006/picture">
                   <pic:nvPicPr>
-                    <pic:cNvPr id="875056994" name=""/>
+                    <pic:cNvPr id="425142570" name=""/>
                     <pic:cNvPicPr/>
                   </pic:nvPicPr>
                   <pic:blipFill>
@@ -1665,7 +1664,7 @@
                   <pic:spPr>
                     <a:xfrm>
                       <a:off x="0" y="0"/>
-                      <a:ext cx="3665538" cy="2720576"/>
+                      <a:ext cx="5760720" cy="1379220"/>
                     </a:xfrm>
                     <a:prstGeom prst="rect">
                       <a:avLst/>
@@ -1842,7 +1841,6 @@
           <w:noProof/>
           <w:lang w:val="fr-CH"/>
         </w:rPr>
-        <w:lastRenderedPageBreak/>
         <w:drawing>
           <wp:inline distT="0" distB="0" distL="0" distR="0" wp14:anchorId="69105564" wp14:editId="32A8D357">
             <wp:extent cx="3734124" cy="1348857"/>
@@ -2440,6 +2438,119 @@
       </w:rPr>
     </w:lvl>
   </w:abstractNum>
+  <w:abstractNum w:abstractNumId="3" w15:restartNumberingAfterBreak="0">
+    <w:nsid w:val="69541668"/>
+    <w:multiLevelType w:val="hybridMultilevel"/>
+    <w:tmpl w:val="B6BA707E"/>
+    <w:lvl w:ilvl="0" w:tplc="08090001">
+      <w:start w:val="1"/>
+      <w:numFmt w:val="bullet"/>
+      <w:lvlText w:val=""/>
+      <w:lvlJc w:val="left"/>
+      <w:pPr>
+        <w:ind w:left="720" w:hanging="360"/>
+      </w:pPr>
+      <w:rPr>
+        <w:rFonts w:ascii="Symbol" w:hAnsi="Symbol" w:hint="default"/>
+      </w:rPr>
+    </w:lvl>
+    <w:lvl w:ilvl="1" w:tplc="08090003" w:tentative="1">
+      <w:start w:val="1"/>
+      <w:numFmt w:val="bullet"/>
+      <w:lvlText w:val="o"/>
+      <w:lvlJc w:val="left"/>
+      <w:pPr>
+        <w:ind w:left="1440" w:hanging="360"/>
+      </w:pPr>
+      <w:rPr>
+        <w:rFonts w:ascii="Courier New" w:hAnsi="Courier New" w:cs="Courier New" w:hint="default"/>
+      </w:rPr>
+    </w:lvl>
+    <w:lvl w:ilvl="2" w:tplc="08090005" w:tentative="1">
+      <w:start w:val="1"/>
+      <w:numFmt w:val="bullet"/>
+      <w:lvlText w:val=""/>
+      <w:lvlJc w:val="left"/>
+      <w:pPr>
+        <w:ind w:left="2160" w:hanging="360"/>
+      </w:pPr>
+      <w:rPr>
+        <w:rFonts w:ascii="Wingdings" w:hAnsi="Wingdings" w:hint="default"/>
+      </w:rPr>
+    </w:lvl>
+    <w:lvl w:ilvl="3" w:tplc="08090001" w:tentative="1">
+      <w:start w:val="1"/>
+      <w:numFmt w:val="bullet"/>
+      <w:lvlText w:val=""/>
+      <w:lvlJc w:val="left"/>
+      <w:pPr>
+        <w:ind w:left="2880" w:hanging="360"/>
+      </w:pPr>
+      <w:rPr>
+        <w:rFonts w:ascii="Symbol" w:hAnsi="Symbol" w:hint="default"/>
+      </w:rPr>
+    </w:lvl>
+    <w:lvl w:ilvl="4" w:tplc="08090003" w:tentative="1">
+      <w:start w:val="1"/>
+      <w:numFmt w:val="bullet"/>
+      <w:lvlText w:val="o"/>
+      <w:lvlJc w:val="left"/>
+      <w:pPr>
+        <w:ind w:left="3600" w:hanging="360"/>
+      </w:pPr>
+      <w:rPr>
+        <w:rFonts w:ascii="Courier New" w:hAnsi="Courier New" w:cs="Courier New" w:hint="default"/>
+      </w:rPr>
+    </w:lvl>
+    <w:lvl w:ilvl="5" w:tplc="08090005" w:tentative="1">
+      <w:start w:val="1"/>
+      <w:numFmt w:val="bullet"/>
+      <w:lvlText w:val=""/>
+      <w:lvlJc w:val="left"/>
+      <w:pPr>
+        <w:ind w:left="4320" w:hanging="360"/>
+      </w:pPr>
+      <w:rPr>
+        <w:rFonts w:ascii="Wingdings" w:hAnsi="Wingdings" w:hint="default"/>
+      </w:rPr>
+    </w:lvl>
+    <w:lvl w:ilvl="6" w:tplc="08090001" w:tentative="1">
+      <w:start w:val="1"/>
+      <w:numFmt w:val="bullet"/>
+      <w:lvlText w:val=""/>
+      <w:lvlJc w:val="left"/>
+      <w:pPr>
+        <w:ind w:left="5040" w:hanging="360"/>
+      </w:pPr>
+      <w:rPr>
+        <w:rFonts w:ascii="Symbol" w:hAnsi="Symbol" w:hint="default"/>
+      </w:rPr>
+    </w:lvl>
+    <w:lvl w:ilvl="7" w:tplc="08090003" w:tentative="1">
+      <w:start w:val="1"/>
+      <w:numFmt w:val="bullet"/>
+      <w:lvlText w:val="o"/>
+      <w:lvlJc w:val="left"/>
+      <w:pPr>
+        <w:ind w:left="5760" w:hanging="360"/>
+      </w:pPr>
+      <w:rPr>
+        <w:rFonts w:ascii="Courier New" w:hAnsi="Courier New" w:cs="Courier New" w:hint="default"/>
+      </w:rPr>
+    </w:lvl>
+    <w:lvl w:ilvl="8" w:tplc="08090005" w:tentative="1">
+      <w:start w:val="1"/>
+      <w:numFmt w:val="bullet"/>
+      <w:lvlText w:val=""/>
+      <w:lvlJc w:val="left"/>
+      <w:pPr>
+        <w:ind w:left="6480" w:hanging="360"/>
+      </w:pPr>
+      <w:rPr>
+        <w:rFonts w:ascii="Wingdings" w:hAnsi="Wingdings" w:hint="default"/>
+      </w:rPr>
+    </w:lvl>
+  </w:abstractNum>
   <w:num w:numId="1" w16cid:durableId="511990856">
     <w:abstractNumId w:val="1"/>
   </w:num>
@@ -2448,6 +2559,9 @@
   </w:num>
   <w:num w:numId="3" w16cid:durableId="1754087350">
     <w:abstractNumId w:val="0"/>
+  </w:num>
+  <w:num w:numId="4" w16cid:durableId="245262612">
+    <w:abstractNumId w:val="3"/>
   </w:num>
 </w:numbering>
 </file>

</xml_diff>